<commit_message>
added final report as pdf file
</commit_message>
<xml_diff>
--- a/docs/report/report.docx
+++ b/docs/report/report.docx
@@ -2660,7 +2660,7 @@
           <w:rPr>
             <w:webHidden/>
           </w:rPr>
-          <w:t>5</w:t>
+          <w:t>7</w:t>
         </w:r>
         <w:r>
           <w:rPr>
@@ -2724,7 +2724,7 @@
           <w:rPr>
             <w:webHidden/>
           </w:rPr>
-          <w:t>8</w:t>
+          <w:t>10</w:t>
         </w:r>
         <w:r>
           <w:rPr>
@@ -2788,7 +2788,7 @@
           <w:rPr>
             <w:webHidden/>
           </w:rPr>
-          <w:t>9</w:t>
+          <w:t>11</w:t>
         </w:r>
         <w:r>
           <w:rPr>
@@ -2852,7 +2852,7 @@
           <w:rPr>
             <w:webHidden/>
           </w:rPr>
-          <w:t>9</w:t>
+          <w:t>11</w:t>
         </w:r>
         <w:r>
           <w:rPr>
@@ -2916,7 +2916,7 @@
           <w:rPr>
             <w:webHidden/>
           </w:rPr>
-          <w:t>10</w:t>
+          <w:t>12</w:t>
         </w:r>
         <w:r>
           <w:rPr>
@@ -2980,7 +2980,7 @@
           <w:rPr>
             <w:webHidden/>
           </w:rPr>
-          <w:t>13</w:t>
+          <w:t>15</w:t>
         </w:r>
         <w:r>
           <w:rPr>
@@ -3071,7 +3071,7 @@
           <w:rPr>
             <w:webHidden/>
           </w:rPr>
-          <w:t>7</w:t>
+          <w:t>9</w:t>
         </w:r>
         <w:r>
           <w:rPr>
@@ -5537,7 +5537,7 @@
       </w:pPr>
       <w:r>
         <w:drawing>
-          <wp:inline distT="0" distB="0" distL="0" distR="0" wp14:anchorId="63E3F62D" wp14:editId="2E2D2453">
+          <wp:inline distT="0" distB="0" distL="0" distR="0" wp14:anchorId="63E3F62D" wp14:editId="37C9E7EF">
             <wp:extent cx="4061789" cy="2552700"/>
             <wp:effectExtent l="0" t="0" r="0" b="0"/>
             <wp:docPr id="212687921" name="Picture 8"/>

</xml_diff>

<commit_message>
presentation: added a pptx and pdf presentation regarding the documentation
</commit_message>
<xml_diff>
--- a/docs/report/report.docx
+++ b/docs/report/report.docx
@@ -5537,7 +5537,7 @@
       </w:pPr>
       <w:r>
         <w:drawing>
-          <wp:inline distT="0" distB="0" distL="0" distR="0" wp14:anchorId="63E3F62D" wp14:editId="37C9E7EF">
+          <wp:inline distT="0" distB="0" distL="0" distR="0" wp14:anchorId="63E3F62D" wp14:editId="088EB214">
             <wp:extent cx="4061789" cy="2552700"/>
             <wp:effectExtent l="0" t="0" r="0" b="0"/>
             <wp:docPr id="212687921" name="Picture 8"/>
@@ -6880,7 +6880,27 @@
           <w:szCs w:val="24"/>
           <w:lang w:val="ro-RO"/>
         </w:rPr>
-        <w:t>În concluzie, tehnologia Powerline nu este doar o metodă de a evita găurirea pereților pentru cabluri noi. Ea reprezintă o soluție strategică de "reciclare" a infrastructurii electrice, transformând-o într-o rețea de date globală, sigură și adaptată cerințelor tehnologice ale anului 2026.</w:t>
+        <w:t xml:space="preserve">În concluzie, tehnologia </w:t>
+      </w:r>
+      <w:proofErr w:type="spellStart"/>
+      <w:r>
+        <w:rPr>
+          <w:rFonts w:ascii="UT Sans" w:hAnsi="UT Sans"/>
+          <w:sz w:val="24"/>
+          <w:szCs w:val="24"/>
+          <w:lang w:val="ro-RO"/>
+        </w:rPr>
+        <w:t>Powerline</w:t>
+      </w:r>
+      <w:proofErr w:type="spellEnd"/>
+      <w:r>
+        <w:rPr>
+          <w:rFonts w:ascii="UT Sans" w:hAnsi="UT Sans"/>
+          <w:sz w:val="24"/>
+          <w:szCs w:val="24"/>
+          <w:lang w:val="ro-RO"/>
+        </w:rPr>
+        <w:t xml:space="preserve"> nu este doar o metodă de a evita găurirea pereților pentru cabluri noi. Ea reprezintă o soluție strategică de "reciclare" a infrastructurii electrice, transformând-o într-o rețea de date globală, sigură și adaptată cerințelor tehnologice ale anului 2026.</w:t>
       </w:r>
     </w:p>
     <w:p>

</xml_diff>